<commit_message>
Eli's disclosure and edits to CL
</commit_message>
<xml_diff>
--- a/AER_I_Submission/ACF_CL.docx
+++ b/AER_I_Submission/ACF_CL.docx
@@ -121,93 +121,7 @@
         <w:rPr>
           <w:rFonts w:ascii="Times New Roman" w:hAnsi="Times New Roman" w:cs="Times New Roman"/>
         </w:rPr>
-        <w:t>We are</w:t>
-      </w:r>
-      <w:r>
-        <w:rPr>
-          <w:rFonts w:ascii="Times New Roman" w:hAnsi="Times New Roman" w:cs="Times New Roman"/>
-        </w:rPr>
-        <w:t xml:space="preserve"> submitting</w:t>
-      </w:r>
-      <w:r>
-        <w:rPr>
-          <w:rFonts w:ascii="Times New Roman" w:hAnsi="Times New Roman" w:cs="Times New Roman"/>
-        </w:rPr>
-        <w:t xml:space="preserve"> </w:t>
-      </w:r>
-      <w:r>
-        <w:rPr>
-          <w:rFonts w:ascii="Times New Roman" w:hAnsi="Times New Roman" w:cs="Times New Roman"/>
-        </w:rPr>
-        <w:t>the paper “</w:t>
-      </w:r>
-      <w:r>
-        <w:rPr>
-          <w:rFonts w:ascii="Times New Roman" w:hAnsi="Times New Roman" w:cs="Times New Roman"/>
-        </w:rPr>
-        <w:t>Natural Capital and the Measurement of</w:t>
-      </w:r>
-      <w:r>
-        <w:rPr>
-          <w:rFonts w:ascii="Times New Roman" w:hAnsi="Times New Roman" w:cs="Times New Roman"/>
-        </w:rPr>
-        <w:t xml:space="preserve">” </w:t>
-      </w:r>
-      <w:r>
-        <w:rPr>
-          <w:rFonts w:ascii="Times New Roman" w:hAnsi="Times New Roman" w:cs="Times New Roman"/>
-        </w:rPr>
-        <w:t xml:space="preserve">for consideration </w:t>
-      </w:r>
-      <w:r>
-        <w:rPr>
-          <w:rFonts w:ascii="Times New Roman" w:hAnsi="Times New Roman" w:cs="Times New Roman"/>
-        </w:rPr>
-        <w:t>at</w:t>
-      </w:r>
-      <w:r>
-        <w:rPr>
-          <w:rFonts w:ascii="Times New Roman" w:hAnsi="Times New Roman" w:cs="Times New Roman"/>
-        </w:rPr>
-        <w:t xml:space="preserve"> </w:t>
-      </w:r>
-      <w:r>
-        <w:rPr>
-          <w:rFonts w:ascii="Times New Roman" w:hAnsi="Times New Roman" w:cs="Times New Roman"/>
-          <w:i/>
-          <w:iCs/>
-        </w:rPr>
-        <w:t xml:space="preserve">American Economic </w:t>
-      </w:r>
-      <w:r>
-        <w:rPr>
-          <w:rFonts w:ascii="Times New Roman" w:hAnsi="Times New Roman" w:cs="Times New Roman"/>
-          <w:i/>
-          <w:iCs/>
-        </w:rPr>
-        <w:t>Review</w:t>
-      </w:r>
-      <w:r>
-        <w:rPr>
-          <w:rFonts w:ascii="Times New Roman" w:hAnsi="Times New Roman" w:cs="Times New Roman"/>
-          <w:i/>
-          <w:iCs/>
-        </w:rPr>
-        <w:t>:</w:t>
-      </w:r>
-      <w:r>
-        <w:rPr>
-          <w:rFonts w:ascii="Times New Roman" w:hAnsi="Times New Roman" w:cs="Times New Roman"/>
-          <w:i/>
-          <w:iCs/>
-        </w:rPr>
-        <w:t xml:space="preserve"> Insights </w:t>
-      </w:r>
-      <w:r>
-        <w:rPr>
-          <w:rFonts w:ascii="Times New Roman" w:hAnsi="Times New Roman" w:cs="Times New Roman"/>
-        </w:rPr>
-        <w:t>(</w:t>
+        <w:t>Please accept “Natural Capital and the Measurement of Productivity” for consideration for publication at American Economic Review: Insights (</w:t>
       </w:r>
       <w:proofErr w:type="gramStart"/>
       <w:r>
@@ -221,157 +135,35 @@
         <w:rPr>
           <w:rFonts w:ascii="Times New Roman" w:hAnsi="Times New Roman" w:cs="Times New Roman"/>
         </w:rPr>
-        <w:t>)</w:t>
-      </w:r>
-      <w:r>
-        <w:rPr>
-          <w:rFonts w:ascii="Times New Roman" w:hAnsi="Times New Roman" w:cs="Times New Roman"/>
-          <w:i/>
-          <w:iCs/>
-        </w:rPr>
-        <w:t>.</w:t>
-      </w:r>
-      <w:r>
-        <w:rPr>
-          <w:rFonts w:ascii="Times New Roman" w:hAnsi="Times New Roman" w:cs="Times New Roman"/>
-        </w:rPr>
-        <w:t xml:space="preserve"> </w:t>
-      </w:r>
-      <w:r>
-        <w:rPr>
-          <w:rFonts w:ascii="Times New Roman" w:hAnsi="Times New Roman" w:cs="Times New Roman"/>
-        </w:rPr>
-        <w:t>The</w:t>
-      </w:r>
-      <w:r>
-        <w:rPr>
-          <w:rFonts w:ascii="Times New Roman" w:hAnsi="Times New Roman" w:cs="Times New Roman"/>
-        </w:rPr>
-        <w:t xml:space="preserve"> manuscript</w:t>
-      </w:r>
-      <w:r>
-        <w:rPr>
-          <w:rFonts w:ascii="Times New Roman" w:hAnsi="Times New Roman" w:cs="Times New Roman"/>
-        </w:rPr>
-        <w:t xml:space="preserve"> </w:t>
-      </w:r>
-      <w:r>
-        <w:rPr>
-          <w:rFonts w:ascii="Times New Roman" w:hAnsi="Times New Roman" w:cs="Times New Roman"/>
-        </w:rPr>
-        <w:t>includes a</w:t>
-      </w:r>
-      <w:r>
-        <w:rPr>
-          <w:rFonts w:ascii="Times New Roman" w:hAnsi="Times New Roman" w:cs="Times New Roman"/>
-        </w:rPr>
-        <w:t xml:space="preserve">n </w:t>
-      </w:r>
-      <w:r>
-        <w:rPr>
-          <w:rFonts w:ascii="Times New Roman" w:hAnsi="Times New Roman" w:cs="Times New Roman"/>
-        </w:rPr>
-        <w:t>appendix, meant for online publication only, which has been uploaded with this submission.</w:t>
-      </w:r>
-      <w:r>
-        <w:rPr>
-          <w:rFonts w:ascii="Times New Roman" w:hAnsi="Times New Roman" w:cs="Times New Roman"/>
-        </w:rPr>
-        <w:t xml:space="preserve"> </w:t>
-      </w:r>
-      <w:r>
-        <w:rPr>
-          <w:rFonts w:ascii="Times New Roman" w:hAnsi="Times New Roman" w:cs="Times New Roman"/>
-        </w:rPr>
-        <w:t>Among the coeditors</w:t>
-      </w:r>
-      <w:r>
-        <w:rPr>
-          <w:rFonts w:ascii="Times New Roman" w:hAnsi="Times New Roman" w:cs="Times New Roman"/>
-        </w:rPr>
-        <w:t xml:space="preserve"> at </w:t>
+        <w:t xml:space="preserve">). The role of natural resources and the environment in economy is a longstanding question. Recent changes (2025) to the System of National Accounts guidance and a substantial Beyond GDP policy pushes make understanding the role of natural resources that much more important. In the manuscript, we connect natural resources to TFP measurement, we provide theory and measurement that suggest that omitting natural resources can bias TFP estimates at scales that are important for long-run budget forecasts and other macroeconomic concerns. The manuscript includes an appendix, intended for online-only publication. We recommend Tatyana </w:t>
+      </w:r>
+      <w:proofErr w:type="spellStart"/>
+      <w:r>
+        <w:rPr>
+          <w:rFonts w:ascii="Times New Roman" w:hAnsi="Times New Roman" w:cs="Times New Roman"/>
+        </w:rPr>
+        <w:t>Deryugina</w:t>
+      </w:r>
+      <w:proofErr w:type="spellEnd"/>
+      <w:r>
+        <w:rPr>
+          <w:rFonts w:ascii="Times New Roman" w:hAnsi="Times New Roman" w:cs="Times New Roman"/>
+        </w:rPr>
+        <w:t xml:space="preserve"> or Seema Jayachandran from among the coeditors at </w:t>
       </w:r>
       <w:proofErr w:type="gramStart"/>
       <w:r>
         <w:rPr>
           <w:rFonts w:ascii="Times New Roman" w:hAnsi="Times New Roman" w:cs="Times New Roman"/>
         </w:rPr>
-        <w:t>AER:I</w:t>
+        <w:t>AER:I.</w:t>
       </w:r>
       <w:proofErr w:type="gramEnd"/>
       <w:r>
         <w:rPr>
           <w:rFonts w:ascii="Times New Roman" w:hAnsi="Times New Roman" w:cs="Times New Roman"/>
         </w:rPr>
-        <w:t xml:space="preserve">, </w:t>
-      </w:r>
-      <w:r>
-        <w:rPr>
-          <w:rFonts w:ascii="Times New Roman" w:hAnsi="Times New Roman" w:cs="Times New Roman"/>
-        </w:rPr>
-        <w:t xml:space="preserve">either </w:t>
-      </w:r>
-      <w:r>
-        <w:rPr>
-          <w:rFonts w:ascii="Times New Roman" w:hAnsi="Times New Roman" w:cs="Times New Roman"/>
-        </w:rPr>
-        <w:t xml:space="preserve">Tatyana </w:t>
-      </w:r>
-      <w:proofErr w:type="spellStart"/>
-      <w:r>
-        <w:rPr>
-          <w:rFonts w:ascii="Times New Roman" w:hAnsi="Times New Roman" w:cs="Times New Roman"/>
-        </w:rPr>
-        <w:t>Deryugina</w:t>
-      </w:r>
-      <w:proofErr w:type="spellEnd"/>
-      <w:r>
-        <w:rPr>
-          <w:rFonts w:ascii="Times New Roman" w:hAnsi="Times New Roman" w:cs="Times New Roman"/>
-        </w:rPr>
-        <w:t xml:space="preserve"> or </w:t>
-      </w:r>
-      <w:r>
-        <w:rPr>
-          <w:rFonts w:ascii="Times New Roman" w:hAnsi="Times New Roman" w:cs="Times New Roman"/>
-        </w:rPr>
-        <w:t>Seema Jayachandran</w:t>
-      </w:r>
-      <w:r>
-        <w:rPr>
-          <w:rFonts w:ascii="Times New Roman" w:hAnsi="Times New Roman" w:cs="Times New Roman"/>
-        </w:rPr>
-        <w:t xml:space="preserve"> </w:t>
-      </w:r>
-      <w:r>
-        <w:rPr>
-          <w:rFonts w:ascii="Times New Roman" w:hAnsi="Times New Roman" w:cs="Times New Roman"/>
-        </w:rPr>
-        <w:t xml:space="preserve">would be best suited to determine whether this submission merits review given </w:t>
-      </w:r>
-      <w:r>
-        <w:rPr>
-          <w:rFonts w:ascii="Times New Roman" w:hAnsi="Times New Roman" w:cs="Times New Roman"/>
-        </w:rPr>
-        <w:t>their</w:t>
-      </w:r>
-      <w:r>
-        <w:rPr>
-          <w:rFonts w:ascii="Times New Roman" w:hAnsi="Times New Roman" w:cs="Times New Roman"/>
-        </w:rPr>
-        <w:t xml:space="preserve"> work on </w:t>
-      </w:r>
-      <w:r>
-        <w:rPr>
-          <w:rFonts w:ascii="Times New Roman" w:hAnsi="Times New Roman" w:cs="Times New Roman"/>
-        </w:rPr>
-        <w:t>environmental economics generally</w:t>
-      </w:r>
-      <w:r>
-        <w:rPr>
-          <w:rFonts w:ascii="Times New Roman" w:hAnsi="Times New Roman" w:cs="Times New Roman"/>
-        </w:rPr>
-        <w:t xml:space="preserve">. </w:t>
+        <w:t xml:space="preserve"> The manuscript is not under review or consideration elsewhere. Please contact me with any further questions.</w:t>
       </w:r>
     </w:p>
     <w:p>

</xml_diff>